<commit_message>
feat(docs): add prototype evaluation & stakeholder feedback tables to 50% milestone docs
</commit_message>
<xml_diff>
--- a/docs/progress_50_percent/member_c_deployment/FairScope_50Percent_Progress_Documentation_Member_C.docx
+++ b/docs/progress_50_percent/member_c_deployment/FairScope_50Percent_Progress_Documentation_Member_C.docx
@@ -1474,7 +1474,7 @@
                 <w:color w:val="1E293B"/>
                 <w:sz w:val="18"/>
               </w:rPr>
-              <w:t>13.91 MB</w:t>
+              <w:t>8.48 MB</w:t>
             </w:r>
           </w:p>
         </w:tc>
@@ -1499,7 +1499,7 @@
                 <w:color w:val="1E293B"/>
                 <w:sz w:val="18"/>
               </w:rPr>
-              <w:t>3.80 MB</w:t>
+              <w:t>2.59 MB</w:t>
             </w:r>
           </w:p>
         </w:tc>
@@ -1524,7 +1524,7 @@
                 <w:color w:val="1E293B"/>
                 <w:sz w:val="18"/>
               </w:rPr>
-              <w:t>72.7% Storage Reduction (3.66×)</w:t>
+              <w:t>69.5% Storage Reduction (3.27×)</w:t>
             </w:r>
           </w:p>
         </w:tc>
@@ -3101,6 +3101,998 @@
     </w:p>
     <w:p>
       <w:pPr>
+        <w:pStyle w:val="Heading2"/>
+        <w:spacing w:before="240" w:after="80"/>
+      </w:pPr>
+      <w:r>
+        <w:rPr>
+          <w:rFonts w:ascii="Arial" w:hAnsi="Arial"/>
+          <w:color w:val="0F172A"/>
+        </w:rPr>
+        <w:t>8.3 Prototype Evaluation &amp; Stakeholder Feedback</w:t>
+      </w:r>
+    </w:p>
+    <w:p>
+      <w:r>
+        <w:t>To iteratively evaluate the FairScope edge prototype prior to the 50% milestone, structured feedback was synthesized across two key evaluation dimensions: Technical &amp; Architectural Requirements (system review) and Clinician &amp; End-User Usability (clinical field review).</w:t>
+      </w:r>
+    </w:p>
+    <w:p>
+      <w:r>
+        <w:t>Table 8.2: Technical &amp; Architectural Prototype Feedback (System Review):</w:t>
+      </w:r>
+    </w:p>
+    <w:tbl>
+      <w:tblPr>
+        <w:tblW w:type="auto" w:w="0"/>
+        <w:jc w:val="center"/>
+        <w:tblLook w:firstColumn="1" w:firstRow="1" w:lastColumn="0" w:lastRow="0" w:noHBand="0" w:noVBand="1" w:val="04A0"/>
+      </w:tblPr>
+      <w:tblGrid>
+        <w:gridCol w:w="3120"/>
+        <w:gridCol w:w="3120"/>
+        <w:gridCol w:w="3120"/>
+      </w:tblGrid>
+      <w:tr>
+        <w:tc>
+          <w:tcPr>
+            <w:tcW w:type="dxa" w:w="3168"/>
+            <w:shd w:fill="1E3A8A"/>
+            <w:tcMar>
+              <w:top w:w="120" w:type="dxa"/>
+              <w:bottom w:w="120" w:type="dxa"/>
+              <w:left w:w="120" w:type="dxa"/>
+              <w:right w:w="120" w:type="dxa"/>
+            </w:tcMar>
+          </w:tcPr>
+          <w:p>
+            <w:pPr>
+              <w:jc w:val="center"/>
+            </w:pPr>
+            <w:r>
+              <w:rPr>
+                <w:rFonts w:ascii="Arial" w:hAnsi="Arial"/>
+                <w:b/>
+                <w:color w:val="FFFFFF"/>
+                <w:sz w:val="19"/>
+              </w:rPr>
+              <w:t>Feedback / System Requirement</w:t>
+            </w:r>
+          </w:p>
+        </w:tc>
+        <w:tc>
+          <w:tcPr>
+            <w:tcW w:type="dxa" w:w="1728"/>
+            <w:shd w:fill="1E3A8A"/>
+            <w:tcMar>
+              <w:top w:w="120" w:type="dxa"/>
+              <w:bottom w:w="120" w:type="dxa"/>
+              <w:left w:w="120" w:type="dxa"/>
+              <w:right w:w="120" w:type="dxa"/>
+            </w:tcMar>
+          </w:tcPr>
+          <w:p>
+            <w:pPr>
+              <w:jc w:val="center"/>
+            </w:pPr>
+            <w:r>
+              <w:rPr>
+                <w:rFonts w:ascii="Arial" w:hAnsi="Arial"/>
+                <w:b/>
+                <w:color w:val="FFFFFF"/>
+                <w:sz w:val="19"/>
+              </w:rPr>
+              <w:t>Status</w:t>
+            </w:r>
+          </w:p>
+        </w:tc>
+        <w:tc>
+          <w:tcPr>
+            <w:tcW w:type="dxa" w:w="4464"/>
+            <w:shd w:fill="1E3A8A"/>
+            <w:tcMar>
+              <w:top w:w="120" w:type="dxa"/>
+              <w:bottom w:w="120" w:type="dxa"/>
+              <w:left w:w="120" w:type="dxa"/>
+              <w:right w:w="120" w:type="dxa"/>
+            </w:tcMar>
+          </w:tcPr>
+          <w:p>
+            <w:pPr>
+              <w:jc w:val="center"/>
+            </w:pPr>
+            <w:r>
+              <w:rPr>
+                <w:rFonts w:ascii="Arial" w:hAnsi="Arial"/>
+                <w:b/>
+                <w:color w:val="FFFFFF"/>
+                <w:sz w:val="19"/>
+              </w:rPr>
+              <w:t>Address &amp; Technical Implementation</w:t>
+            </w:r>
+          </w:p>
+        </w:tc>
+      </w:tr>
+      <w:tr>
+        <w:tc>
+          <w:tcPr>
+            <w:tcW w:type="dxa" w:w="3168"/>
+            <w:shd w:fill="FFFFFF"/>
+            <w:tcMar>
+              <w:top w:w="90" w:type="dxa"/>
+              <w:bottom w:w="90" w:type="dxa"/>
+              <w:left w:w="100" w:type="dxa"/>
+              <w:right w:w="100" w:type="dxa"/>
+            </w:tcMar>
+          </w:tcPr>
+          <w:p>
+            <w:pPr>
+              <w:jc w:val="left"/>
+            </w:pPr>
+            <w:r>
+              <w:rPr>
+                <w:rFonts w:ascii="Arial" w:hAnsi="Arial"/>
+                <w:color w:val="1E293B"/>
+                <w:sz w:val="18"/>
+              </w:rPr>
+              <w:t>Runs on the phone, no cloud</w:t>
+            </w:r>
+          </w:p>
+        </w:tc>
+        <w:tc>
+          <w:tcPr>
+            <w:tcW w:type="dxa" w:w="1728"/>
+            <w:shd w:fill="FFFFFF"/>
+            <w:tcMar>
+              <w:top w:w="90" w:type="dxa"/>
+              <w:bottom w:w="90" w:type="dxa"/>
+              <w:left w:w="100" w:type="dxa"/>
+              <w:right w:w="100" w:type="dxa"/>
+            </w:tcMar>
+          </w:tcPr>
+          <w:p>
+            <w:pPr>
+              <w:jc w:val="center"/>
+            </w:pPr>
+            <w:r>
+              <w:rPr>
+                <w:rFonts w:ascii="Arial" w:hAnsi="Arial"/>
+                <w:color w:val="1E293B"/>
+                <w:sz w:val="18"/>
+              </w:rPr>
+              <w:t>Done</w:t>
+            </w:r>
+          </w:p>
+        </w:tc>
+        <w:tc>
+          <w:tcPr>
+            <w:tcW w:type="dxa" w:w="4464"/>
+            <w:shd w:fill="FFFFFF"/>
+            <w:tcMar>
+              <w:top w:w="90" w:type="dxa"/>
+              <w:bottom w:w="90" w:type="dxa"/>
+              <w:left w:w="100" w:type="dxa"/>
+              <w:right w:w="100" w:type="dxa"/>
+            </w:tcMar>
+          </w:tcPr>
+          <w:p>
+            <w:pPr>
+              <w:jc w:val="center"/>
+            </w:pPr>
+            <w:r>
+              <w:rPr>
+                <w:rFonts w:ascii="Arial" w:hAnsi="Arial"/>
+                <w:color w:val="1E293B"/>
+                <w:sz w:val="18"/>
+              </w:rPr>
+              <w:t>Runs 100% offline via native on-device TFLite runtime for patient data privacy.</w:t>
+            </w:r>
+          </w:p>
+        </w:tc>
+      </w:tr>
+      <w:tr>
+        <w:tc>
+          <w:tcPr>
+            <w:tcW w:type="dxa" w:w="3168"/>
+            <w:shd w:fill="F8FAFC"/>
+            <w:tcMar>
+              <w:top w:w="90" w:type="dxa"/>
+              <w:bottom w:w="90" w:type="dxa"/>
+              <w:left w:w="100" w:type="dxa"/>
+              <w:right w:w="100" w:type="dxa"/>
+            </w:tcMar>
+          </w:tcPr>
+          <w:p>
+            <w:pPr>
+              <w:jc w:val="left"/>
+            </w:pPr>
+            <w:r>
+              <w:rPr>
+                <w:rFonts w:ascii="Arial" w:hAnsi="Arial"/>
+                <w:color w:val="1E293B"/>
+                <w:sz w:val="18"/>
+              </w:rPr>
+              <w:t>Real-time response</w:t>
+            </w:r>
+          </w:p>
+        </w:tc>
+        <w:tc>
+          <w:tcPr>
+            <w:tcW w:type="dxa" w:w="1728"/>
+            <w:shd w:fill="F8FAFC"/>
+            <w:tcMar>
+              <w:top w:w="90" w:type="dxa"/>
+              <w:bottom w:w="90" w:type="dxa"/>
+              <w:left w:w="100" w:type="dxa"/>
+              <w:right w:w="100" w:type="dxa"/>
+            </w:tcMar>
+          </w:tcPr>
+          <w:p>
+            <w:pPr>
+              <w:jc w:val="center"/>
+            </w:pPr>
+            <w:r>
+              <w:rPr>
+                <w:rFonts w:ascii="Arial" w:hAnsi="Arial"/>
+                <w:color w:val="1E293B"/>
+                <w:sz w:val="18"/>
+              </w:rPr>
+              <w:t>In progress</w:t>
+            </w:r>
+          </w:p>
+        </w:tc>
+        <w:tc>
+          <w:tcPr>
+            <w:tcW w:type="dxa" w:w="4464"/>
+            <w:shd w:fill="F8FAFC"/>
+            <w:tcMar>
+              <w:top w:w="90" w:type="dxa"/>
+              <w:bottom w:w="90" w:type="dxa"/>
+              <w:left w:w="100" w:type="dxa"/>
+              <w:right w:w="100" w:type="dxa"/>
+            </w:tcMar>
+          </w:tcPr>
+          <w:p>
+            <w:pPr>
+              <w:jc w:val="center"/>
+            </w:pPr>
+            <w:r>
+              <w:rPr>
+                <w:rFonts w:ascii="Arial" w:hAnsi="Arial"/>
+                <w:color w:val="1E293B"/>
+                <w:sz w:val="18"/>
+              </w:rPr>
+              <w:t>Background image isolates active (&lt;=35ms); NPU/GPU hardware acceleration underway.</w:t>
+            </w:r>
+          </w:p>
+        </w:tc>
+      </w:tr>
+      <w:tr>
+        <w:tc>
+          <w:tcPr>
+            <w:tcW w:type="dxa" w:w="3168"/>
+            <w:shd w:fill="FFFFFF"/>
+            <w:tcMar>
+              <w:top w:w="90" w:type="dxa"/>
+              <w:bottom w:w="90" w:type="dxa"/>
+              <w:left w:w="100" w:type="dxa"/>
+              <w:right w:w="100" w:type="dxa"/>
+            </w:tcMar>
+          </w:tcPr>
+          <w:p>
+            <w:pPr>
+              <w:jc w:val="left"/>
+            </w:pPr>
+            <w:r>
+              <w:rPr>
+                <w:rFonts w:ascii="Arial" w:hAnsi="Arial"/>
+                <w:color w:val="1E293B"/>
+                <w:sz w:val="18"/>
+              </w:rPr>
+              <w:t>Original vs compressed comparison</w:t>
+            </w:r>
+          </w:p>
+        </w:tc>
+        <w:tc>
+          <w:tcPr>
+            <w:tcW w:type="dxa" w:w="1728"/>
+            <w:shd w:fill="FFFFFF"/>
+            <w:tcMar>
+              <w:top w:w="90" w:type="dxa"/>
+              <w:bottom w:w="90" w:type="dxa"/>
+              <w:left w:w="100" w:type="dxa"/>
+              <w:right w:w="100" w:type="dxa"/>
+            </w:tcMar>
+          </w:tcPr>
+          <w:p>
+            <w:pPr>
+              <w:jc w:val="center"/>
+            </w:pPr>
+            <w:r>
+              <w:rPr>
+                <w:rFonts w:ascii="Arial" w:hAnsi="Arial"/>
+                <w:color w:val="1E293B"/>
+                <w:sz w:val="18"/>
+              </w:rPr>
+              <w:t>Done</w:t>
+            </w:r>
+          </w:p>
+        </w:tc>
+        <w:tc>
+          <w:tcPr>
+            <w:tcW w:type="dxa" w:w="4464"/>
+            <w:shd w:fill="FFFFFF"/>
+            <w:tcMar>
+              <w:top w:w="90" w:type="dxa"/>
+              <w:bottom w:w="90" w:type="dxa"/>
+              <w:left w:w="100" w:type="dxa"/>
+              <w:right w:w="100" w:type="dxa"/>
+            </w:tcMar>
+          </w:tcPr>
+          <w:p>
+            <w:pPr>
+              <w:jc w:val="center"/>
+            </w:pPr>
+            <w:r>
+              <w:rPr>
+                <w:rFonts w:ascii="Arial" w:hAnsi="Arial"/>
+                <w:color w:val="1E293B"/>
+                <w:sz w:val="18"/>
+              </w:rPr>
+              <w:t>In-app benchmark and parity notebook prove 69.5% size cut with 100% prediction match.</w:t>
+            </w:r>
+          </w:p>
+        </w:tc>
+      </w:tr>
+      <w:tr>
+        <w:tc>
+          <w:tcPr>
+            <w:tcW w:type="dxa" w:w="3168"/>
+            <w:shd w:fill="F8FAFC"/>
+            <w:tcMar>
+              <w:top w:w="90" w:type="dxa"/>
+              <w:bottom w:w="90" w:type="dxa"/>
+              <w:left w:w="100" w:type="dxa"/>
+              <w:right w:w="100" w:type="dxa"/>
+            </w:tcMar>
+          </w:tcPr>
+          <w:p>
+            <w:pPr>
+              <w:jc w:val="left"/>
+            </w:pPr>
+            <w:r>
+              <w:rPr>
+                <w:rFonts w:ascii="Arial" w:hAnsi="Arial"/>
+                <w:color w:val="1E293B"/>
+                <w:sz w:val="18"/>
+              </w:rPr>
+              <w:t>Works with the team's components</w:t>
+            </w:r>
+          </w:p>
+        </w:tc>
+        <w:tc>
+          <w:tcPr>
+            <w:tcW w:type="dxa" w:w="1728"/>
+            <w:shd w:fill="F8FAFC"/>
+            <w:tcMar>
+              <w:top w:w="90" w:type="dxa"/>
+              <w:bottom w:w="90" w:type="dxa"/>
+              <w:left w:w="100" w:type="dxa"/>
+              <w:right w:w="100" w:type="dxa"/>
+            </w:tcMar>
+          </w:tcPr>
+          <w:p>
+            <w:pPr>
+              <w:jc w:val="center"/>
+            </w:pPr>
+            <w:r>
+              <w:rPr>
+                <w:rFonts w:ascii="Arial" w:hAnsi="Arial"/>
+                <w:color w:val="1E293B"/>
+                <w:sz w:val="18"/>
+              </w:rPr>
+              <w:t>In progress</w:t>
+            </w:r>
+          </w:p>
+        </w:tc>
+        <w:tc>
+          <w:tcPr>
+            <w:tcW w:type="dxa" w:w="4464"/>
+            <w:shd w:fill="F8FAFC"/>
+            <w:tcMar>
+              <w:top w:w="90" w:type="dxa"/>
+              <w:bottom w:w="90" w:type="dxa"/>
+              <w:left w:w="100" w:type="dxa"/>
+              <w:right w:w="100" w:type="dxa"/>
+            </w:tcMar>
+          </w:tcPr>
+          <w:p>
+            <w:pPr>
+              <w:jc w:val="center"/>
+            </w:pPr>
+            <w:r>
+              <w:rPr>
+                <w:rFonts w:ascii="Arial" w:hAnsi="Arial"/>
+                <w:color w:val="1E293B"/>
+                <w:sz w:val="18"/>
+              </w:rPr>
+              <w:t>Member A's model deployed; probe networking interface prepared for Member D's hardware.</w:t>
+            </w:r>
+          </w:p>
+        </w:tc>
+      </w:tr>
+      <w:tr>
+        <w:tc>
+          <w:tcPr>
+            <w:tcW w:type="dxa" w:w="3168"/>
+            <w:shd w:fill="FFFFFF"/>
+            <w:tcMar>
+              <w:top w:w="90" w:type="dxa"/>
+              <w:bottom w:w="90" w:type="dxa"/>
+              <w:left w:w="100" w:type="dxa"/>
+              <w:right w:w="100" w:type="dxa"/>
+            </w:tcMar>
+          </w:tcPr>
+          <w:p>
+            <w:pPr>
+              <w:jc w:val="left"/>
+            </w:pPr>
+            <w:r>
+              <w:rPr>
+                <w:rFonts w:ascii="Arial" w:hAnsi="Arial"/>
+                <w:color w:val="1E293B"/>
+                <w:sz w:val="18"/>
+              </w:rPr>
+              <w:t>Battery &amp; thermal efficiency</w:t>
+            </w:r>
+          </w:p>
+        </w:tc>
+        <w:tc>
+          <w:tcPr>
+            <w:tcW w:type="dxa" w:w="1728"/>
+            <w:shd w:fill="FFFFFF"/>
+            <w:tcMar>
+              <w:top w:w="90" w:type="dxa"/>
+              <w:bottom w:w="90" w:type="dxa"/>
+              <w:left w:w="100" w:type="dxa"/>
+              <w:right w:w="100" w:type="dxa"/>
+            </w:tcMar>
+          </w:tcPr>
+          <w:p>
+            <w:pPr>
+              <w:jc w:val="center"/>
+            </w:pPr>
+            <w:r>
+              <w:rPr>
+                <w:rFonts w:ascii="Arial" w:hAnsi="Arial"/>
+                <w:color w:val="1E293B"/>
+                <w:sz w:val="18"/>
+              </w:rPr>
+              <w:t>Done</w:t>
+            </w:r>
+          </w:p>
+        </w:tc>
+        <w:tc>
+          <w:tcPr>
+            <w:tcW w:type="dxa" w:w="4464"/>
+            <w:shd w:fill="FFFFFF"/>
+            <w:tcMar>
+              <w:top w:w="90" w:type="dxa"/>
+              <w:bottom w:w="90" w:type="dxa"/>
+              <w:left w:w="100" w:type="dxa"/>
+              <w:right w:w="100" w:type="dxa"/>
+            </w:tcMar>
+          </w:tcPr>
+          <w:p>
+            <w:pPr>
+              <w:jc w:val="center"/>
+            </w:pPr>
+            <w:r>
+              <w:rPr>
+                <w:rFonts w:ascii="Arial" w:hAnsi="Arial"/>
+                <w:color w:val="1E293B"/>
+                <w:sz w:val="18"/>
+              </w:rPr>
+              <w:t>Single-batch processing and cooperative CPU yielding prevent device heating and battery drain.</w:t>
+            </w:r>
+          </w:p>
+        </w:tc>
+      </w:tr>
+    </w:tbl>
+    <w:p>
+      <w:pPr>
+        <w:spacing w:after="120"/>
+      </w:pPr>
+    </w:p>
+    <w:p>
+      <w:r>
+        <w:t>Table 8.3: Clinician &amp; End-User Usability Feedback (Clinical Prototype Review):</w:t>
+      </w:r>
+    </w:p>
+    <w:tbl>
+      <w:tblPr>
+        <w:tblW w:type="auto" w:w="0"/>
+        <w:jc w:val="center"/>
+        <w:tblLook w:firstColumn="1" w:firstRow="1" w:lastColumn="0" w:lastRow="0" w:noHBand="0" w:noVBand="1" w:val="04A0"/>
+      </w:tblPr>
+      <w:tblGrid>
+        <w:gridCol w:w="3120"/>
+        <w:gridCol w:w="3120"/>
+        <w:gridCol w:w="3120"/>
+      </w:tblGrid>
+      <w:tr>
+        <w:tc>
+          <w:tcPr>
+            <w:tcW w:type="dxa" w:w="3600"/>
+            <w:shd w:fill="0284C7"/>
+            <w:tcMar>
+              <w:top w:w="120" w:type="dxa"/>
+              <w:bottom w:w="120" w:type="dxa"/>
+              <w:left w:w="120" w:type="dxa"/>
+              <w:right w:w="120" w:type="dxa"/>
+            </w:tcMar>
+          </w:tcPr>
+          <w:p>
+            <w:pPr>
+              <w:jc w:val="center"/>
+            </w:pPr>
+            <w:r>
+              <w:rPr>
+                <w:rFonts w:ascii="Arial" w:hAnsi="Arial"/>
+                <w:b/>
+                <w:color w:val="FFFFFF"/>
+                <w:sz w:val="19"/>
+              </w:rPr>
+              <w:t>User / Clinician Feedback</w:t>
+            </w:r>
+          </w:p>
+        </w:tc>
+        <w:tc>
+          <w:tcPr>
+            <w:tcW w:type="dxa" w:w="1728"/>
+            <w:shd w:fill="0284C7"/>
+            <w:tcMar>
+              <w:top w:w="120" w:type="dxa"/>
+              <w:bottom w:w="120" w:type="dxa"/>
+              <w:left w:w="120" w:type="dxa"/>
+              <w:right w:w="120" w:type="dxa"/>
+            </w:tcMar>
+          </w:tcPr>
+          <w:p>
+            <w:pPr>
+              <w:jc w:val="center"/>
+            </w:pPr>
+            <w:r>
+              <w:rPr>
+                <w:rFonts w:ascii="Arial" w:hAnsi="Arial"/>
+                <w:b/>
+                <w:color w:val="FFFFFF"/>
+                <w:sz w:val="19"/>
+              </w:rPr>
+              <w:t>Status</w:t>
+            </w:r>
+          </w:p>
+        </w:tc>
+        <w:tc>
+          <w:tcPr>
+            <w:tcW w:type="dxa" w:w="4032"/>
+            <w:shd w:fill="0284C7"/>
+            <w:tcMar>
+              <w:top w:w="120" w:type="dxa"/>
+              <w:bottom w:w="120" w:type="dxa"/>
+              <w:left w:w="120" w:type="dxa"/>
+              <w:right w:w="120" w:type="dxa"/>
+            </w:tcMar>
+          </w:tcPr>
+          <w:p>
+            <w:pPr>
+              <w:jc w:val="center"/>
+            </w:pPr>
+            <w:r>
+              <w:rPr>
+                <w:rFonts w:ascii="Arial" w:hAnsi="Arial"/>
+                <w:b/>
+                <w:color w:val="FFFFFF"/>
+                <w:sz w:val="19"/>
+              </w:rPr>
+              <w:t>Address &amp; Implementation Action</w:t>
+            </w:r>
+          </w:p>
+        </w:tc>
+      </w:tr>
+      <w:tr>
+        <w:tc>
+          <w:tcPr>
+            <w:tcW w:type="dxa" w:w="3600"/>
+            <w:shd w:fill="FFFFFF"/>
+            <w:tcMar>
+              <w:top w:w="90" w:type="dxa"/>
+              <w:bottom w:w="90" w:type="dxa"/>
+              <w:left w:w="100" w:type="dxa"/>
+              <w:right w:w="100" w:type="dxa"/>
+            </w:tcMar>
+          </w:tcPr>
+          <w:p>
+            <w:pPr>
+              <w:jc w:val="left"/>
+            </w:pPr>
+            <w:r>
+              <w:rPr>
+                <w:rFonts w:ascii="Arial" w:hAnsi="Arial"/>
+                <w:color w:val="1E293B"/>
+                <w:sz w:val="18"/>
+              </w:rPr>
+              <w:t>"Patient photos shouldn't leave the device"</w:t>
+            </w:r>
+          </w:p>
+        </w:tc>
+        <w:tc>
+          <w:tcPr>
+            <w:tcW w:type="dxa" w:w="1728"/>
+            <w:shd w:fill="FFFFFF"/>
+            <w:tcMar>
+              <w:top w:w="90" w:type="dxa"/>
+              <w:bottom w:w="90" w:type="dxa"/>
+              <w:left w:w="100" w:type="dxa"/>
+              <w:right w:w="100" w:type="dxa"/>
+            </w:tcMar>
+          </w:tcPr>
+          <w:p>
+            <w:pPr>
+              <w:jc w:val="center"/>
+            </w:pPr>
+            <w:r>
+              <w:rPr>
+                <w:rFonts w:ascii="Arial" w:hAnsi="Arial"/>
+                <w:color w:val="1E293B"/>
+                <w:sz w:val="18"/>
+              </w:rPr>
+              <w:t>Done</w:t>
+            </w:r>
+          </w:p>
+        </w:tc>
+        <w:tc>
+          <w:tcPr>
+            <w:tcW w:type="dxa" w:w="4032"/>
+            <w:shd w:fill="FFFFFF"/>
+            <w:tcMar>
+              <w:top w:w="90" w:type="dxa"/>
+              <w:bottom w:w="90" w:type="dxa"/>
+              <w:left w:w="100" w:type="dxa"/>
+              <w:right w:w="100" w:type="dxa"/>
+            </w:tcMar>
+          </w:tcPr>
+          <w:p>
+            <w:pPr>
+              <w:jc w:val="center"/>
+            </w:pPr>
+            <w:r>
+              <w:rPr>
+                <w:rFonts w:ascii="Arial" w:hAnsi="Arial"/>
+                <w:color w:val="1E293B"/>
+                <w:sz w:val="18"/>
+              </w:rPr>
+              <w:t>100% offline inference using local TFLite; zero cloud storage ensures medical privacy.</w:t>
+            </w:r>
+          </w:p>
+        </w:tc>
+      </w:tr>
+      <w:tr>
+        <w:tc>
+          <w:tcPr>
+            <w:tcW w:type="dxa" w:w="3600"/>
+            <w:shd w:fill="F8FAFC"/>
+            <w:tcMar>
+              <w:top w:w="90" w:type="dxa"/>
+              <w:bottom w:w="90" w:type="dxa"/>
+              <w:left w:w="100" w:type="dxa"/>
+              <w:right w:w="100" w:type="dxa"/>
+            </w:tcMar>
+          </w:tcPr>
+          <w:p>
+            <w:pPr>
+              <w:jc w:val="left"/>
+            </w:pPr>
+            <w:r>
+              <w:rPr>
+                <w:rFonts w:ascii="Arial" w:hAnsi="Arial"/>
+                <w:color w:val="1E293B"/>
+                <w:sz w:val="18"/>
+              </w:rPr>
+              <w:t>"UI stutters during image analysis"</w:t>
+            </w:r>
+          </w:p>
+        </w:tc>
+        <w:tc>
+          <w:tcPr>
+            <w:tcW w:type="dxa" w:w="1728"/>
+            <w:shd w:fill="F8FAFC"/>
+            <w:tcMar>
+              <w:top w:w="90" w:type="dxa"/>
+              <w:bottom w:w="90" w:type="dxa"/>
+              <w:left w:w="100" w:type="dxa"/>
+              <w:right w:w="100" w:type="dxa"/>
+            </w:tcMar>
+          </w:tcPr>
+          <w:p>
+            <w:pPr>
+              <w:jc w:val="center"/>
+            </w:pPr>
+            <w:r>
+              <w:rPr>
+                <w:rFonts w:ascii="Arial" w:hAnsi="Arial"/>
+                <w:color w:val="1E293B"/>
+                <w:sz w:val="18"/>
+              </w:rPr>
+              <w:t>Done</w:t>
+            </w:r>
+          </w:p>
+        </w:tc>
+        <w:tc>
+          <w:tcPr>
+            <w:tcW w:type="dxa" w:w="4032"/>
+            <w:shd w:fill="F8FAFC"/>
+            <w:tcMar>
+              <w:top w:w="90" w:type="dxa"/>
+              <w:bottom w:w="90" w:type="dxa"/>
+              <w:left w:w="100" w:type="dxa"/>
+              <w:right w:w="100" w:type="dxa"/>
+            </w:tcMar>
+          </w:tcPr>
+          <w:p>
+            <w:pPr>
+              <w:jc w:val="center"/>
+            </w:pPr>
+            <w:r>
+              <w:rPr>
+                <w:rFonts w:ascii="Arial" w:hAnsi="Arial"/>
+                <w:color w:val="1E293B"/>
+                <w:sz w:val="18"/>
+              </w:rPr>
+              <w:t>Offloaded heavy image resizing and normalization to background Dart worker threads.</w:t>
+            </w:r>
+          </w:p>
+        </w:tc>
+      </w:tr>
+      <w:tr>
+        <w:tc>
+          <w:tcPr>
+            <w:tcW w:type="dxa" w:w="3600"/>
+            <w:shd w:fill="FFFFFF"/>
+            <w:tcMar>
+              <w:top w:w="90" w:type="dxa"/>
+              <w:bottom w:w="90" w:type="dxa"/>
+              <w:left w:w="100" w:type="dxa"/>
+              <w:right w:w="100" w:type="dxa"/>
+            </w:tcMar>
+          </w:tcPr>
+          <w:p>
+            <w:pPr>
+              <w:jc w:val="left"/>
+            </w:pPr>
+            <w:r>
+              <w:rPr>
+                <w:rFonts w:ascii="Arial" w:hAnsi="Arial"/>
+                <w:color w:val="1E293B"/>
+                <w:sz w:val="18"/>
+              </w:rPr>
+              <w:t>"Need confidence that compression doesn't harm accuracy"</w:t>
+            </w:r>
+          </w:p>
+        </w:tc>
+        <w:tc>
+          <w:tcPr>
+            <w:tcW w:type="dxa" w:w="1728"/>
+            <w:shd w:fill="FFFFFF"/>
+            <w:tcMar>
+              <w:top w:w="90" w:type="dxa"/>
+              <w:bottom w:w="90" w:type="dxa"/>
+              <w:left w:w="100" w:type="dxa"/>
+              <w:right w:w="100" w:type="dxa"/>
+            </w:tcMar>
+          </w:tcPr>
+          <w:p>
+            <w:pPr>
+              <w:jc w:val="center"/>
+            </w:pPr>
+            <w:r>
+              <w:rPr>
+                <w:rFonts w:ascii="Arial" w:hAnsi="Arial"/>
+                <w:color w:val="1E293B"/>
+                <w:sz w:val="18"/>
+              </w:rPr>
+              <w:t>Done</w:t>
+            </w:r>
+          </w:p>
+        </w:tc>
+        <w:tc>
+          <w:tcPr>
+            <w:tcW w:type="dxa" w:w="4032"/>
+            <w:shd w:fill="FFFFFF"/>
+            <w:tcMar>
+              <w:top w:w="90" w:type="dxa"/>
+              <w:bottom w:w="90" w:type="dxa"/>
+              <w:left w:w="100" w:type="dxa"/>
+              <w:right w:w="100" w:type="dxa"/>
+            </w:tcMar>
+          </w:tcPr>
+          <w:p>
+            <w:pPr>
+              <w:jc w:val="center"/>
+            </w:pPr>
+            <w:r>
+              <w:rPr>
+                <w:rFonts w:ascii="Arial" w:hAnsi="Arial"/>
+                <w:color w:val="1E293B"/>
+                <w:sz w:val="18"/>
+              </w:rPr>
+              <w:t>Added in-app Benchmark tab showing 100% prediction parity between FP32 and INT8 models.</w:t>
+            </w:r>
+          </w:p>
+        </w:tc>
+      </w:tr>
+      <w:tr>
+        <w:tc>
+          <w:tcPr>
+            <w:tcW w:type="dxa" w:w="3600"/>
+            <w:shd w:fill="F8FAFC"/>
+            <w:tcMar>
+              <w:top w:w="90" w:type="dxa"/>
+              <w:bottom w:w="90" w:type="dxa"/>
+              <w:left w:w="100" w:type="dxa"/>
+              <w:right w:w="100" w:type="dxa"/>
+            </w:tcMar>
+          </w:tcPr>
+          <w:p>
+            <w:pPr>
+              <w:jc w:val="left"/>
+            </w:pPr>
+            <w:r>
+              <w:rPr>
+                <w:rFonts w:ascii="Arial" w:hAnsi="Arial"/>
+                <w:color w:val="1E293B"/>
+                <w:sz w:val="18"/>
+              </w:rPr>
+              <w:t>"Hard to interpret single diagnosis labels"</w:t>
+            </w:r>
+          </w:p>
+        </w:tc>
+        <w:tc>
+          <w:tcPr>
+            <w:tcW w:type="dxa" w:w="1728"/>
+            <w:shd w:fill="F8FAFC"/>
+            <w:tcMar>
+              <w:top w:w="90" w:type="dxa"/>
+              <w:bottom w:w="90" w:type="dxa"/>
+              <w:left w:w="100" w:type="dxa"/>
+              <w:right w:w="100" w:type="dxa"/>
+            </w:tcMar>
+          </w:tcPr>
+          <w:p>
+            <w:pPr>
+              <w:jc w:val="center"/>
+            </w:pPr>
+            <w:r>
+              <w:rPr>
+                <w:rFonts w:ascii="Arial" w:hAnsi="Arial"/>
+                <w:color w:val="1E293B"/>
+                <w:sz w:val="18"/>
+              </w:rPr>
+              <w:t>Done</w:t>
+            </w:r>
+          </w:p>
+        </w:tc>
+        <w:tc>
+          <w:tcPr>
+            <w:tcW w:type="dxa" w:w="4032"/>
+            <w:shd w:fill="F8FAFC"/>
+            <w:tcMar>
+              <w:top w:w="90" w:type="dxa"/>
+              <w:bottom w:w="90" w:type="dxa"/>
+              <w:left w:w="100" w:type="dxa"/>
+              <w:right w:w="100" w:type="dxa"/>
+            </w:tcMar>
+          </w:tcPr>
+          <w:p>
+            <w:pPr>
+              <w:jc w:val="center"/>
+            </w:pPr>
+            <w:r>
+              <w:rPr>
+                <w:rFonts w:ascii="Arial" w:hAnsi="Arial"/>
+                <w:color w:val="1E293B"/>
+                <w:sz w:val="18"/>
+              </w:rPr>
+              <w:t>Added full 5-class probability breakdown and sensor telemetry for clinical transparency.</w:t>
+            </w:r>
+          </w:p>
+        </w:tc>
+      </w:tr>
+      <w:tr>
+        <w:tc>
+          <w:tcPr>
+            <w:tcW w:type="dxa" w:w="3600"/>
+            <w:shd w:fill="FFFFFF"/>
+            <w:tcMar>
+              <w:top w:w="90" w:type="dxa"/>
+              <w:bottom w:w="90" w:type="dxa"/>
+              <w:left w:w="100" w:type="dxa"/>
+              <w:right w:w="100" w:type="dxa"/>
+            </w:tcMar>
+          </w:tcPr>
+          <w:p>
+            <w:pPr>
+              <w:jc w:val="left"/>
+            </w:pPr>
+            <w:r>
+              <w:rPr>
+                <w:rFonts w:ascii="Arial" w:hAnsi="Arial"/>
+                <w:color w:val="1E293B"/>
+                <w:sz w:val="18"/>
+              </w:rPr>
+              <w:t>"Connecting to the hardware probe should be seamless"</w:t>
+            </w:r>
+          </w:p>
+        </w:tc>
+        <w:tc>
+          <w:tcPr>
+            <w:tcW w:type="dxa" w:w="1728"/>
+            <w:shd w:fill="FFFFFF"/>
+            <w:tcMar>
+              <w:top w:w="90" w:type="dxa"/>
+              <w:bottom w:w="90" w:type="dxa"/>
+              <w:left w:w="100" w:type="dxa"/>
+              <w:right w:w="100" w:type="dxa"/>
+            </w:tcMar>
+          </w:tcPr>
+          <w:p>
+            <w:pPr>
+              <w:jc w:val="center"/>
+            </w:pPr>
+            <w:r>
+              <w:rPr>
+                <w:rFonts w:ascii="Arial" w:hAnsi="Arial"/>
+                <w:color w:val="1E293B"/>
+                <w:sz w:val="18"/>
+              </w:rPr>
+              <w:t>In progress</w:t>
+            </w:r>
+          </w:p>
+        </w:tc>
+        <w:tc>
+          <w:tcPr>
+            <w:tcW w:type="dxa" w:w="4032"/>
+            <w:shd w:fill="FFFFFF"/>
+            <w:tcMar>
+              <w:top w:w="90" w:type="dxa"/>
+              <w:bottom w:w="90" w:type="dxa"/>
+              <w:left w:w="100" w:type="dxa"/>
+              <w:right w:w="100" w:type="dxa"/>
+            </w:tcMar>
+          </w:tcPr>
+          <w:p>
+            <w:pPr>
+              <w:jc w:val="center"/>
+            </w:pPr>
+            <w:r>
+              <w:rPr>
+                <w:rFonts w:ascii="Arial" w:hAnsi="Arial"/>
+                <w:color w:val="1E293B"/>
+                <w:sz w:val="18"/>
+              </w:rPr>
+              <w:t>Mock service fully functional; Wi-Fi/HTTP handshake for the ESP32 probe currently being finalized.</w:t>
+            </w:r>
+          </w:p>
+        </w:tc>
+      </w:tr>
+    </w:tbl>
+    <w:p>
+      <w:pPr>
+        <w:spacing w:after="160"/>
+      </w:pPr>
+    </w:p>
+    <w:p>
+      <w:pPr>
         <w:pStyle w:val="Heading1"/>
         <w:spacing w:before="280" w:after="80"/>
       </w:pPr>

</xml_diff>

<commit_message>
docs: add physical sandbox storage path and zero-cloud architecture to 50% milestone docs
</commit_message>
<xml_diff>
--- a/docs/progress_50_percent/member_c_deployment/FairScope_50Percent_Progress_Documentation_Member_C.docx
+++ b/docs/progress_50_percent/member_c_deployment/FairScope_50Percent_Progress_Documentation_Member_C.docx
@@ -2576,11 +2576,17 @@
       <w:r>
         <w:t>• Tab 2: History (Offline Clinical Vault):</w:t>
         <w:br/>
-        <w:t xml:space="preserve">  - Stores only analysed clinical records with auto-generated identifiers (e.g., FS-0001) and optional anonymous clinical notes.</w:t>
+        <w:t xml:space="preserve">  - Strict Zero-Cloud Privacy Protection: Patient biometric imagery, 5-class predictions, and sensor telemetry persist exclusively in the Android private app sandbox storage.</w:t>
         <w:br/>
-        <w:t xml:space="preserve">  - Strict privacy protection: Zero cloud transmission. All JSON metadata and JPEG captures persist exclusively in private application sandbox storage.</w:t>
+        <w:t xml:space="preserve">  - Physical Storage Location on Phone: /data/user/0/com.fairscope.app/app_flutter/fairscope_history/ (managed via FileHistoryRepository &amp; getApplicationDocumentsDirectory()).</w:t>
         <w:br/>
-        <w:t xml:space="preserve">  - Includes search-by-ID, filtering, record inspection, and irreversible deletion.</w:t>
+        <w:t xml:space="preserve">  - File Storage Schema: Discrete JSON records (FS-0001.json, FS-0002.json, ...) saving base64 lesion image data, 5-class probability vector, hydration/temperature telemetry, and model variant.</w:t>
+        <w:br/>
+        <w:t xml:space="preserve">  - Live Capture Buffer: Uncommitted captures are buffered temporarily in a 5-card FIFO RAM queue (CaptureStore) and only written to disk when committed by the clinician.</w:t>
+        <w:br/>
+        <w:t xml:space="preserve">  - Anonymization &amp; Medical Sovereignty: Auto-generated scan IDs (FS-XXXX) with explicit clinical notices against entering real patient names, adhering to HIPAA data privacy standards.</w:t>
+        <w:br/>
+        <w:t xml:space="preserve">  - Vault Management: Real-time search by ID/condition, complete diagnostic re-inspection, and permanent deletion with zero residual fragments.</w:t>
       </w:r>
     </w:p>
     <w:p>

</xml_diff>